<commit_message>
feat(tarea3): validar conexion oficial con Google Gemini API y actualizar entregables
- Configurar gemini-flash-latest y modelos activos de Google AI Studio
- Permitir deteccion de variables de entorno en el directorio raiz metodos_cuantitativos/.env
- Actualizar reporte .txt y documento Word con auditoria real de inteligencia artificial
</commit_message>
<xml_diff>
--- a/tarea3/outputs/Informe_Tecnico_Simulador_Redes.docx
+++ b/tarea3/outputs/Informe_Tecnico_Simulador_Redes.docx
@@ -256,7 +256,7 @@
           </w:tcPr>
           <w:p>
             <w:r>
-              <w:t>120.0 s</w:t>
+              <w:t>60.0 s</w:t>
             </w:r>
           </w:p>
         </w:tc>
@@ -372,7 +372,7 @@
           </w:tcPr>
           <w:p>
             <w:r>
-              <w:t>1773</w:t>
+              <w:t>857</w:t>
             </w:r>
           </w:p>
         </w:tc>
@@ -440,7 +440,7 @@
           </w:tcPr>
           <w:p>
             <w:r>
-              <w:t>0.0708 s</w:t>
+              <w:t>0.0608 s</w:t>
             </w:r>
           </w:p>
         </w:tc>
@@ -464,7 +464,7 @@
           </w:tcPr>
           <w:p>
             <w:r>
-              <w:t>1.29</w:t>
+              <w:t>1.11</w:t>
             </w:r>
           </w:p>
         </w:tc>
@@ -486,7 +486,7 @@
           </w:tcPr>
           <w:p>
             <w:r>
-              <w:t>1.05</w:t>
+              <w:t>0.87</w:t>
             </w:r>
           </w:p>
         </w:tc>
@@ -510,7 +510,7 @@
           </w:tcPr>
           <w:p>
             <w:r>
-              <w:t>$6.28</w:t>
+              <w:t>$2.61</w:t>
             </w:r>
           </w:p>
         </w:tc>
@@ -556,7 +556,7 @@
           </w:tcPr>
           <w:p>
             <w:r>
-              <w:t>$6.28</w:t>
+              <w:t>$2.61</w:t>
             </w:r>
           </w:p>
         </w:tc>
@@ -580,62 +580,80 @@
     </w:p>
     <w:p>
       <w:r>
-        <w:t>1. DIAGNOSTICO DE EFICIENCIA Y TEORIA DE COLAS (M/M/1/K):</w:t>
-        <w:br/>
-        <w:t>- Tasa media de llegada observada: lambda = 15.0 paq/s frente a tasa de servicio mu = 18.0 paq/s.</w:t>
-        <w:br/>
-        <w:t>- Factor de utilizacion por router core: rho = 0.208 (20.8% de ocupacion del canal).</w:t>
-        <w:br/>
-        <w:t>- Tiempo medio en cola (Wq = 0.0708 s): Los paquetes transitan con fluidez por los nodos intermedios.</w:t>
-        <w:br/>
-        <w:t>- Promedio de paquetes en el sistema (L = 1.29): Consistente con la Ley de Little (L = lambda_eff * W).</w:t>
+        <w:t>A continuación se presenta el análisis técnico y cuantitativo del reporte de simulación suministrado.</w:t>
       </w:r>
     </w:p>
     <w:p>
       <w:r>
-        <w:t>2. EVALUACION DEL CONTROL DE INVENTARIO EN BUFFERS:</w:t>
-        <w:br/>
-        <w:t>- Capacidad maxima S = 50 paquetes y Umbral de reabastecimiento s = 10 paquetes.</w:t>
-        <w:br/>
-        <w:t>- Retencion completa de paquetes (0.00% de perdida). La capacidad S=50 paquetes ha contenido adecuadamente las rafagas estocasticas de Poisson.</w:t>
-        <w:br/>
-        <w:t>- Estructura de costos financieros:</w:t>
-        <w:br/>
-        <w:t xml:space="preserve">  * Costo de almacenamiento (Holding RAM): $6.28 (100.0% del costo global).</w:t>
-        <w:br/>
-        <w:t xml:space="preserve">  * Costo de penalizacion por ruptura: $0.00 (0.0% del costo global).</w:t>
-        <w:br/>
-        <w:t xml:space="preserve">  * Costo global del sistema: $6.28.</w:t>
+        <w:t>---</w:t>
       </w:r>
     </w:p>
     <w:p>
       <w:r>
-        <w:t>3. ANALISIS DEL BALANCEO DE CARGA MEDIANTE ALGORITMO HUNGARO:</w:t>
-        <w:br/>
-        <w:t>- La minimizacion continua de la matriz C_ij = Latencia_ij + alpha*(cola_j / S_j) evito cuellos de botella</w:t>
-        <w:br/>
-        <w:t xml:space="preserve">  monofasicos, distribuyendo el trafico hacia los routers con buffers mas despejados.</w:t>
-        <w:br/>
-        <w:t>- Ante simulacion de enlace caido, la penalizacion forzosa a 10^6 reasigno el trafico por rutas</w:t>
-        <w:br/>
-        <w:t xml:space="preserve">  operativas alternas sin interrupcion de servicio.</w:t>
+        <w:t>### 1. Diagnóstico de Eficiencia y Teoría de Colas ($M/M/1/K$ y Factor $\rho$)</w:t>
       </w:r>
     </w:p>
     <w:p>
       <w:r>
-        <w:t>4. TRES (3) RECOMENDACIONES DE OPTIMIZACION DE INGENIERIA:</w:t>
+        <w:t>* **Factor de Utilización del Servidor ($\rho$):**</w:t>
         <w:br/>
-        <w:t>- Recomendacion 1: Dimensionamiento adaptativo de buffer S: Ajustar S a un rango de 60 a 70 paquetes</w:t>
+        <w:t xml:space="preserve">  $$\rho = \frac{\lambda}{\mu} = \frac{15.0 \text{ paq/s}}{18.0 \text{ paq/s}} \approx 0.8333 \quad (83.33\%)$$</w:t>
         <w:br/>
-        <w:t xml:space="preserve">  para absorber picos extremos de trafico sin elevar desproporcionadamente el costo de retencion en memoria.</w:t>
+        <w:t xml:space="preserve">  El sistema opera en una zona de alta carga ($\rho &gt; 0.80$), pero se mantiene en régimen estrictamente ergódico y estable ($\rho &lt; 1$). El servidor atiende a una velocidad $1.2$ veces mayor que la demanda promedio.</w:t>
+      </w:r>
+    </w:p>
+    <w:p>
+      <w:r>
+        <w:t>* **Comportamiento $M/M/1/K$ (donde $K = S = 50$):**</w:t>
         <w:br/>
-        <w:t>- Recomendacion 2: Ajuste estacional de alpha en Algoritmo Hungaro: Incrementar alpha a 60.0 durante</w:t>
+        <w:t xml:space="preserve">  En un modelo $M/M/1/K$, la probabilidad teórica de bloqueo o pérdida $P_K$ por desbordamiento de búfer está dada por:</w:t>
         <w:br/>
-        <w:t xml:space="preserve">  periodos de alta concurrencia para priorizar la evacuacion de colas frente al retardo base de enlace.</w:t>
+        <w:t xml:space="preserve">  $$P_K = \frac{(1 - \rho)\rho^K}{1 - \rho^{K+1}}$$</w:t>
         <w:br/>
-        <w:t>- Recomendacion 3: Escalado elastico de la tasa de servicio mu: Habilitar conmutacion multinucleo para</w:t>
+        <w:t xml:space="preserve">  Sustituyendo $\rho = 0.8333$ y $K = 50$:</w:t>
         <w:br/>
-        <w:t xml:space="preserve">  incrementar mu cuando la saturacion supere el umbral del 75%, reduciendo el tiempo Wq a menos de 0.03 s.</w:t>
+        <w:t xml:space="preserve">  $$P_K \approx \frac{(0.1667)(0.8333)^{50}}{1 - (0.8333)^{51}} \approx 1.51 \times 10^{-5} \quad (0.0015\%)$$</w:t>
+        <w:br/>
+        <w:t xml:space="preserve">  Esto explica con rigor analítico por qué la **Tasa de Pérdida observada es de 0.00%** para un volumen de 857 paquetes procesados: la ventana temporal (60 s) y el tamaño muestral son insuficientes para registrar un evento raro de desbordamiento.</w:t>
+      </w:r>
+    </w:p>
+    <w:p>
+      <w:r>
+        <w:t>* **Tiempos y Ocupación del Sistema:**</w:t>
+        <w:br/>
+        <w:t xml:space="preserve">  * **Tiempo de espera en cola ($W_q = 0.0608\text{ s}$ o $60.8\text{ ms}$):** Corresponde a un retraso de procesamiento bajo para enlaces de datos estándar.</w:t>
+        <w:br/>
+        <w:t xml:space="preserve">  * **Tiempo total en el sistema ($W$):** $W = W_q + \frac{1}{\mu} = 0.0608 + \frac{1}{18} \approx 0.1164\text{ s}$ ($116.4\text{ ms}$).</w:t>
+        <w:br/>
+        <w:t xml:space="preserve">  * **Consistencia con Ley de Little:** $L = \lambda \cdot W \approx 15 \times 0.1164 \approx 1.74$ paquetes en estado estacionario teórico. El valor simulado ($L = 1.11$) es ligeramente inferior, atribuible a las condiciones iniciales del sistema (cola vacía al inicio de los 60 s).</w:t>
+      </w:r>
+    </w:p>
+    <w:p>
+      <w:r>
+        <w:t>---</w:t>
+      </w:r>
+    </w:p>
+    <w:p>
+      <w:r>
+        <w:t>### 2. Evaluación del Control de Inventario en Buffers (Política $(s, S)$, Desborde y Costos)</w:t>
+      </w:r>
+    </w:p>
+    <w:p>
+      <w:r>
+        <w:t>En esta analogía entre redes de datos y gestión de inventario estocástico:</w:t>
+        <w:br/>
+        <w:t>* **Capacidad Máxima ($S = 50$):** Capacidad del búfer (almacén).</w:t>
+        <w:br/>
+        <w:t>* **Umbral de Reabastecimiento ($s = 10$):** Nivel que dispara solicitudes de control de flujo o créditos (ej. ventanas TCP o paquetes de control ICMP Source Quench / BCN).</w:t>
+      </w:r>
+    </w:p>
+    <w:p>
+      <w:r>
+        <w:t>* **Análisis de Costos:**</w:t>
+        <w:br/>
+        <w:t xml:space="preserve">  * **Costo de Ruptura ($0.00):** Al no haber pérdidas por descarte de cola (*drop tail*), no existen penalizaciones por incumplimiento de Acuerdos de Nivel de Servicio (SLA) ni retransmisiones.</w:t>
+        <w:br/>
+        <w:t xml:space="preserve">  * **Costo de Almacenamiento ($2.61):** Representa el consumo de memoria y retención en búfer durante el horizonte temporal ($T = 60\text{ s}$). Dado que $L = 1.11$, el costo unitario de mantener</w:t>
       </w:r>
     </w:p>
     <w:sectPr>

</xml_diff>